<commit_message>
Session 6 pre-flight (John's review) + global leadsanion repair
Companion Demo gains a worked sample of the naming + blessing pattern
(slide-11 style); homework slide drops the quarter break and the paper
Quarterly Pulse (Examen carried through the two weeks; run sheet,
take-home sheet, and the on-screen sheet images updated to match);
Three Questions reframed as a thinking point (no quarterly break, 'next
evening we talk', 'next quarter' dropped from Q1). 'leadsanion' -> Lead
Companion across all ten decks that still carried it (15 instances).
All leader notes rebuilt; new tools/sync-evening-to-onedrive.py is the
standing sync (97 artifacts to Evenings at Home per the filing map).

Co-Authored-By: Claude Fable 5 <noreply@anthropic.com>
</commit_message>
<xml_diff>
--- a/_implementation-notes/evening-series/FotH Evening Session 21 Leader Notes DRAFT v1.docx
+++ b/_implementation-notes/evening-series/FotH Evening Session 21 Leader Notes DRAFT v1.docx
@@ -436,7 +436,7 @@
         <w:ind w:left="216"/>
       </w:pPr>
       <w:r>
-        <w:t>SUB: The demo blessing must be the speakers' own — real words about a real person they know. A covering leader never performs a borrowed blessing; if you are new to this room, demo with a Companion you genuinely know, or let two leadsanions carry the demo.</w:t>
+        <w:t>SUB: The demo blessing must be the speakers' own — real words about a real person they know. A covering leader never performs a borrowed blessing; if you are new to this room, demo with a Companion you genuinely know, or let two Lead Companions carry the demo.</w:t>
       </w:r>
     </w:p>
     <w:p>
@@ -661,7 +661,7 @@
         <w:ind w:left="216"/>
       </w:pPr>
       <w:r>
-        <w:t>2. leadsanions go first to model; then the arranged parent opens for the families (Run Card) — never a cold call on a teen; pass-anytime holds; visitors may pass or share.</w:t>
+        <w:t>2. Lead Companions go first to model; then the arranged parent opens for the families (Run Card) — never a cold call on a teen; pass-anytime holds; visitors may pass or share.</w:t>
       </w:r>
     </w:p>
     <w:p>

</xml_diff>